<commit_message>
docs: deepen v29 v32 study scripts
</commit_message>
<xml_diff>
--- a/docs/studienskripte/word-rohfassungen/woek-g-v29.docx
+++ b/docs/studienskripte/word-rohfassungen/woek-g-v29.docx
@@ -29,7 +29,7 @@
     </w:p>
     <w:p>
       <w:r>
-        <w:t>Track: Grundstudium Wirkungsökonomie Kurscode: woek-g Vorlesungscode: V29 Modul/Abschnitt: G3.2 Titel: WÖk-IDs, Benchmarks und Archetypen Status: Rohfassung V0 · Sprint-Produktionslauf · muss im nächsten Tiefensprint auf 40-50 Seiten erweitert werden Quelle: woek-akademie-app/docs/lehrgaenge/woek-g-v29-woek-ids-benchmarks-archetypen.md Ablage: Markdown-Master in content/studienskripte/woek-g-v29.md, Word-Rohfassung in docs/studienskripte/word-rohfassungen/woek-g-v29.docx Wissensbasis: aktuelles Grundlagenwerk, Website-Korpus inklusive Journal, Akademie-Quelltexte, Glossar, interne Dossiers und externe Fachquellen</w:t>
+        <w:t>Track: Grundstudium Wirkungsökonomie Kurscode: woek-g Vorlesungscode: V29 Modul/Abschnitt: G3.2 Titel: WÖk-IDs, Benchmarks und Archetypen Status: Tiefenskript-Sprint 4 · substanzielle Arbeitsfassung, Claude-CI/CD-Finalisierung offen Quelle: woek-akademie-app/docs/lehrgaenge/woek-g-v29-woek-ids-benchmarks-archetypen.md Ablage: Markdown-Master in content/studienskripte/woek-g-v29.md, Word-Rohfassung in docs/studienskripte/word-rohfassungen/woek-g-v29.docx Wissensbasis: aktuelles Grundlagenwerk, Website-Korpus inklusive Journal, Akademie-Quelltexte, Glossar, interne Dossiers und externe Fachquellen</w:t>
       </w:r>
     </w:p>
     <w:p>
@@ -1425,17 +1425,1527 @@
         <w:pStyle w:val="Heading2"/>
       </w:pPr>
       <w:r>
-        <w:t>7. Prüfungsrelevanz</w:t>
-      </w:r>
-    </w:p>
-    <w:p>
-      <w:r>
-        <w:t>Diese Vorlesung ist prüfungsrelevant, aber die eigentliche Antwortlogik gehört nicht in das öffentliche Studienskript. Zertifikatsfragen, CorrectAnswer, Scoring-Regeln und Fallrubrics werden separat in der geschützten App-Lane unter woek-akademie-app/content/pruefungen/ gepflegt.</w:t>
-      </w:r>
-    </w:p>
-    <w:p>
-      <w:r>
-        <w:t>Für den Fragenpool sind besonders geeignet:</w:t>
+        <w:t>7. Tiefenskript-Erweiterung Sprint 4</w:t>
+      </w:r>
+    </w:p>
+    <w:p>
+      <w:r>
+        <w:t>Status dieser Erweiterung: ausgebaute Arbeitsfassung für Claude-CI/CD, Word-Rohfassung und Reader-Spiegel. Sie ersetzt noch nicht die spätere Satz-, Quellen- und PDF-Finalisierung, bringt die Vorlesung aber aus der Kurzfassung in eine substanzielle Studienskriptfassung.</w:t>
+      </w:r>
+    </w:p>
+    <w:p>
+      <w:pPr>
+        <w:pStyle w:val="Heading3"/>
+      </w:pPr>
+      <w:r>
+        <w:t>7.1 Leitthese</w:t>
+      </w:r>
+    </w:p>
+    <w:p>
+      <w:r>
+        <w:t>WÖk-IDs machen Wirkung adressierbar, Benchmarks machen sie vergleichbar, Archetypen machen Vergleich fair. Ohne diese drei Ebenen bleiben Wirkungsdaten entweder sprachlich, beliebig oder ungerecht.</w:t>
+      </w:r>
+    </w:p>
+    <w:p>
+      <w:r>
+        <w:t>Die Vorlesung bleibt dabei an die Grundregel gebunden: Wirkung ist neutral und relational. Erst die Bewertung im Referenzrahmen Mensch, Planet, Demokratie, SDGs, Agenda 2030 und SDG+ entscheidet, ob eine Veränderung positiv, negativ oder ambivalent einzuordnen ist. Wenn eine Zielgröße gemeint ist, sprechen wir von positiver Netto-Wirkung.</w:t>
+      </w:r>
+    </w:p>
+    <w:p>
+      <w:pPr>
+        <w:pStyle w:val="Heading3"/>
+      </w:pPr>
+      <w:r>
+        <w:t>7.2 Didaktische Einordnung im Studiengang</w:t>
+      </w:r>
+    </w:p>
+    <w:p>
+      <w:r>
+        <w:t>V29 liegt an der Schwelle zwischen begrifflicher Grundlegung und Bewertungsarchitektur. Die Studierenden sollen nicht nur Begriffe wiedergeben, sondern an Fällen erkennen, welche Aussage schon Wirkung behauptet, welche nur Wirkungspotenzial beschreibt und wo ein Wirkungsrisiko offenliegt. Der Tiefensinn dieser Vorlesung liegt deshalb nicht in zusätzlicher Komplexität, sondern in besserer Unterscheidungsfähigkeit.</w:t>
+      </w:r>
+    </w:p>
+    <w:p>
+      <w:r>
+        <w:t>Für die spätere Praxis ist entscheidend, dass jede Analyse vier Ebenen getrennt hält:</w:t>
+      </w:r>
+    </w:p>
+    <w:p>
+      <w:r>
+        <w:t>1. Beschreibung: Was geschieht tatsächlich oder soll geschehen?</w:t>
+      </w:r>
+    </w:p>
+    <w:p>
+      <w:r>
+        <w:t>2. Kausalannahme: Über welchen Mechanismus könnte daraus eine Zustandsveränderung entstehen?</w:t>
+      </w:r>
+    </w:p>
+    <w:p>
+      <w:r>
+        <w:t>3. Bewertung: Welche Richtung hat diese Veränderung im Referenzrahmen?</w:t>
+      </w:r>
+    </w:p>
+    <w:p>
+      <w:r>
+        <w:t>4. Rückkopplung: Welche Entscheidung, Regel, Ressource oder Kommunikation wird dadurch verändert?</w:t>
+      </w:r>
+    </w:p>
+    <w:p>
+      <w:r>
+        <w:t>Wo diese Ebenen vermischt werden, entstehen typische WÖk-Fehler: Aktivität wird als Wirkung ausgegeben, Reichweite ersetzt Zustandsveränderung, gute Absicht verdeckt Nebenwirkungen oder Reporting wird mit Lernen verwechselt.</w:t>
+      </w:r>
+    </w:p>
+    <w:p>
+      <w:pPr>
+        <w:pStyle w:val="Heading3"/>
+      </w:pPr>
+      <w:r>
+        <w:t>7.3 Analysemodell</w:t>
+      </w:r>
+    </w:p>
+    <w:tbl>
+      <w:tblPr>
+        <w:tblStyle w:val="TableGrid"/>
+        <w:tblW w:type="auto" w:w="0"/>
+        <w:jc w:val="left"/>
+        <w:tblLook w:firstColumn="1" w:firstRow="1" w:lastColumn="0" w:lastRow="0" w:noHBand="0" w:noVBand="1" w:val="04A0"/>
+      </w:tblPr>
+      <w:tblGrid>
+        <w:gridCol w:w="2340"/>
+        <w:gridCol w:w="2340"/>
+        <w:gridCol w:w="2340"/>
+        <w:gridCol w:w="2340"/>
+      </w:tblGrid>
+      <w:tr>
+        <w:tc>
+          <w:tcPr>
+            <w:tcW w:type="dxa" w:w="2340"/>
+            <w:vAlign w:val="center"/>
+          </w:tcPr>
+          <w:p>
+            <w:r>
+              <w:rPr>
+                <w:b/>
+              </w:rPr>
+              <w:t>Analyseobjekt</w:t>
+            </w:r>
+          </w:p>
+        </w:tc>
+        <w:tc>
+          <w:tcPr>
+            <w:tcW w:type="dxa" w:w="2340"/>
+            <w:vAlign w:val="center"/>
+          </w:tcPr>
+          <w:p>
+            <w:r>
+              <w:rPr>
+                <w:b/>
+              </w:rPr>
+              <w:t>Woran es wirkt</w:t>
+            </w:r>
+          </w:p>
+        </w:tc>
+        <w:tc>
+          <w:tcPr>
+            <w:tcW w:type="dxa" w:w="2340"/>
+            <w:vAlign w:val="center"/>
+          </w:tcPr>
+          <w:p>
+            <w:r>
+              <w:rPr>
+                <w:b/>
+              </w:rPr>
+              <w:t>Typischer Fehler</w:t>
+            </w:r>
+          </w:p>
+        </w:tc>
+        <w:tc>
+          <w:tcPr>
+            <w:tcW w:type="dxa" w:w="2340"/>
+            <w:vAlign w:val="center"/>
+          </w:tcPr>
+          <w:p>
+            <w:r>
+              <w:rPr>
+                <w:b/>
+              </w:rPr>
+              <w:t>Saubere WÖk-Lesart</w:t>
+            </w:r>
+          </w:p>
+        </w:tc>
+      </w:tr>
+      <w:tr>
+        <w:tc>
+          <w:tcPr>
+            <w:tcW w:type="dxa" w:w="2340"/>
+            <w:vAlign w:val="center"/>
+          </w:tcPr>
+          <w:p>
+            <w:r>
+              <w:t>WÖk-ID</w:t>
+            </w:r>
+          </w:p>
+        </w:tc>
+        <w:tc>
+          <w:tcPr>
+            <w:tcW w:type="dxa" w:w="2340"/>
+            <w:vAlign w:val="center"/>
+          </w:tcPr>
+          <w:p>
+            <w:r>
+              <w:t>eindeutige Adresse eines Wirkungsindikators</w:t>
+            </w:r>
+          </w:p>
+        </w:tc>
+        <w:tc>
+          <w:tcPr>
+            <w:tcW w:type="dxa" w:w="2340"/>
+            <w:vAlign w:val="center"/>
+          </w:tcPr>
+          <w:p>
+            <w:r>
+              <w:t>ID als Score oder Urteil lesen</w:t>
+            </w:r>
+          </w:p>
+        </w:tc>
+        <w:tc>
+          <w:tcPr>
+            <w:tcW w:type="dxa" w:w="2340"/>
+            <w:vAlign w:val="center"/>
+          </w:tcPr>
+          <w:p>
+            <w:r>
+              <w:t>Indikator, Einheit, Quelle, Version und Prüfstatus trennen</w:t>
+            </w:r>
+          </w:p>
+        </w:tc>
+      </w:tr>
+      <w:tr>
+        <w:tc>
+          <w:tcPr>
+            <w:tcW w:type="dxa" w:w="2340"/>
+            <w:vAlign w:val="center"/>
+          </w:tcPr>
+          <w:p>
+            <w:r>
+              <w:t>Benchmark</w:t>
+            </w:r>
+          </w:p>
+        </w:tc>
+        <w:tc>
+          <w:tcPr>
+            <w:tcW w:type="dxa" w:w="2340"/>
+            <w:vAlign w:val="center"/>
+          </w:tcPr>
+          <w:p>
+            <w:r>
+              <w:t>Vergleichsmaßstab für eine Branche, Produktgruppe oder Maßnahme</w:t>
+            </w:r>
+          </w:p>
+        </w:tc>
+        <w:tc>
+          <w:tcPr>
+            <w:tcW w:type="dxa" w:w="2340"/>
+            <w:vAlign w:val="center"/>
+          </w:tcPr>
+          <w:p>
+            <w:r>
+              <w:t>alle Akteure am selben Wert messen</w:t>
+            </w:r>
+          </w:p>
+        </w:tc>
+        <w:tc>
+          <w:tcPr>
+            <w:tcW w:type="dxa" w:w="2340"/>
+            <w:vAlign w:val="center"/>
+          </w:tcPr>
+          <w:p>
+            <w:r>
+              <w:t>Vergleichsgruppe und Systemgrenze offenlegen</w:t>
+            </w:r>
+          </w:p>
+        </w:tc>
+      </w:tr>
+      <w:tr>
+        <w:tc>
+          <w:tcPr>
+            <w:tcW w:type="dxa" w:w="2340"/>
+            <w:vAlign w:val="center"/>
+          </w:tcPr>
+          <w:p>
+            <w:r>
+              <w:t>Archetyp</w:t>
+            </w:r>
+          </w:p>
+        </w:tc>
+        <w:tc>
+          <w:tcPr>
+            <w:tcW w:type="dxa" w:w="2340"/>
+            <w:vAlign w:val="center"/>
+          </w:tcPr>
+          <w:p>
+            <w:r>
+              <w:t>typischer Fall oder Strukturtyp für faire Bewertung</w:t>
+            </w:r>
+          </w:p>
+        </w:tc>
+        <w:tc>
+          <w:tcPr>
+            <w:tcW w:type="dxa" w:w="2340"/>
+            <w:vAlign w:val="center"/>
+          </w:tcPr>
+          <w:p>
+            <w:r>
+              <w:t>Einzelfälle über einen Kamm scheren</w:t>
+            </w:r>
+          </w:p>
+        </w:tc>
+        <w:tc>
+          <w:tcPr>
+            <w:tcW w:type="dxa" w:w="2340"/>
+            <w:vAlign w:val="center"/>
+          </w:tcPr>
+          <w:p>
+            <w:r>
+              <w:t>passende Vergleichsfamilie bilden</w:t>
+            </w:r>
+          </w:p>
+        </w:tc>
+      </w:tr>
+      <w:tr>
+        <w:tc>
+          <w:tcPr>
+            <w:tcW w:type="dxa" w:w="2340"/>
+            <w:vAlign w:val="center"/>
+          </w:tcPr>
+          <w:p>
+            <w:r>
+              <w:t>Skala</w:t>
+            </w:r>
+          </w:p>
+        </w:tc>
+        <w:tc>
+          <w:tcPr>
+            <w:tcW w:type="dxa" w:w="2340"/>
+            <w:vAlign w:val="center"/>
+          </w:tcPr>
+          <w:p>
+            <w:r>
+              <w:t>Übersetzung von Messwerten in Bewertungsstufen</w:t>
+            </w:r>
+          </w:p>
+        </w:tc>
+        <w:tc>
+          <w:tcPr>
+            <w:tcW w:type="dxa" w:w="2340"/>
+            <w:vAlign w:val="center"/>
+          </w:tcPr>
+          <w:p>
+            <w:r>
+              <w:t>Skala als Naturgesetz behandeln</w:t>
+            </w:r>
+          </w:p>
+        </w:tc>
+        <w:tc>
+          <w:tcPr>
+            <w:tcW w:type="dxa" w:w="2340"/>
+            <w:vAlign w:val="center"/>
+          </w:tcPr>
+          <w:p>
+            <w:r>
+              <w:t>Skala begründen, versionieren und korrigierbar halten</w:t>
+            </w:r>
+          </w:p>
+        </w:tc>
+      </w:tr>
+    </w:tbl>
+    <w:p/>
+    <w:p>
+      <w:pPr>
+        <w:pStyle w:val="Heading3"/>
+      </w:pPr>
+      <w:r>
+        <w:t>7.4 Modellformel</w:t>
+      </w:r>
+    </w:p>
+    <w:p>
+      <w:r>
+        <w:t>Die folgende Formel ist ein didaktisches Denkmodell, kein amtlicher Bewertungsstandard:</w:t>
+      </w:r>
+    </w:p>
+    <w:p>
+      <w:r>
+        <w:t>Bewertung_fair = Messwert(WÖktext-ID) \; im \; Kontext(Benchmark, Archetyp, Datenqualitaet)</w:t>
+      </w:r>
+    </w:p>
+    <w:p>
+      <w:r>
+        <w:t>Der Messwert wird erst fair bewertbar, wenn klar ist, welcher Indikator gemeint ist, welche Vergleichsgruppe gilt und wie belastbar die Daten sind.</w:t>
+      </w:r>
+    </w:p>
+    <w:p>
+      <w:r>
+        <w:t>Die Formel soll gerade keine Scheingenauigkeit erzeugen. Sie zwingt dazu, die Faktoren offen zu legen, die eine Aussage tragen. In einem echten Bewertungsprozess müssten Datenquelle, Aktualität, Datenqualitätsklasse, Unsicherheitsgrad und Rückkopplungsregel ergänzt werden.</w:t>
+      </w:r>
+    </w:p>
+    <w:p>
+      <w:pPr>
+        <w:pStyle w:val="Heading3"/>
+      </w:pPr>
+      <w:r>
+        <w:t>7.5 Fallfenster</w:t>
+      </w:r>
+    </w:p>
+    <w:p>
+      <w:r>
+        <w:t>Fall 1. Wasserverbrauch ist kein einziger Indikator. Relevant sind Standort, Wasserstress, Wiederverwendung, Lieferkettenbezug, Produktgruppe und Zeit. Eine WÖk-ID ordnet, welcher Wasseraspekt gemeint ist.</w:t>
+      </w:r>
+    </w:p>
+    <w:p>
+      <w:r>
+        <w:t>Fall 2. Ein Krankenhaus, eine Schule und ein Chemiewerk können Energieverbrauch nicht mit derselben Erwartung bewerten. Archetypen schützen davor, notwendige Funktionen mit schlechter Wirkung zu verwechseln.</w:t>
+      </w:r>
+    </w:p>
+    <w:p>
+      <w:pPr>
+        <w:pStyle w:val="Heading3"/>
+      </w:pPr>
+      <w:r>
+        <w:t>7.6 Prüfungsnahe Fallfragen ohne geschützte Antwortlogik</w:t>
+      </w:r>
+    </w:p>
+    <w:p>
+      <w:r>
+        <w:t>Diese Fragen sind öffentlich und dienen dem Lernen. Die geschützte Antwortlogik, Scoring-Regeln und CorrectAnswer-Felder bleiben in der Prüfungs-Lane der App.</w:t>
+      </w:r>
+    </w:p>
+    <w:p>
+      <w:r>
+        <w:t>1. Beschreibe den Auslöser im Fall und trenne ihn von Absicht, Image oder Reichweite.</w:t>
+      </w:r>
+    </w:p>
+    <w:p>
+      <w:r>
+        <w:t>2. Formuliere einen plausiblen Wirkpfad mit Wirkungsempfängern, Zustandsveränderung und Rückkopplung.</w:t>
+      </w:r>
+    </w:p>
+    <w:p>
+      <w:r>
+        <w:t>3. Benenne mindestens ein Wirkungspotenzial und ein Wirkungsrisiko.</w:t>
+      </w:r>
+    </w:p>
+    <w:p>
+      <w:r>
+        <w:t>4. Zeige, welche Quelle oder Datenart nötig wäre, um von Potenzial zu belastbarer Wirkungsaussage zu kommen.</w:t>
+      </w:r>
+    </w:p>
+    <w:p>
+      <w:r>
+        <w:t>5. Prüfe, ob Nichtkompensation oder Reverse Merit Order einschlägig sein könnten.</w:t>
+      </w:r>
+    </w:p>
+    <w:p>
+      <w:r>
+        <w:t>6. Formuliere eine saubere Wirkungsaussage in einem Satz: Was wissen wir, was nehmen wir an, was bleibt offen?</w:t>
+      </w:r>
+    </w:p>
+    <w:p>
+      <w:pPr>
+        <w:pStyle w:val="Heading3"/>
+      </w:pPr>
+      <w:r>
+        <w:t>7.7 Auswertung aus der lebenden Website-Referenz</w:t>
+      </w:r>
+    </w:p>
+    <w:p>
+      <w:pPr>
+        <w:pStyle w:val="Heading3"/>
+      </w:pPr>
+      <w:r>
+        <w:t>Quellenanker: Kapitel 31 - WÖk-IDs und Indikatorenarchitektur</w:t>
+      </w:r>
+    </w:p>
+    <w:p>
+      <w:r>
+        <w:t>Interne Quelle: referenz/kapitel-031-woek-ids-und-indikatorenarchitektur/index.html</w:t>
+      </w:r>
+    </w:p>
+    <w:p>
+      <w:r>
+        <w:t>Kapitel 30 hat geklärt, warum Wirkung messbar werden muss, ohne auf Zahlen reduziert zu werden. Messung braucht empirische Daten, systemische Einordnung und normative Bewertung. Dieses Kapitel führt die Ordnungseinheit ein, mit der Wirkungsdaten adressierbar werden: die WÖk-ID.</w:t>
+      </w:r>
+    </w:p>
+    <w:p>
+      <w:r>
+        <w:t>Eine WÖk-ID ist eine standardisierte Kennziffer für einen Wirkungsindikator innerhalb der Wirkungsökonomie. Sie ist nicht der Score selbst, nicht die vollständige Bewertung und nicht die Scorecard. Sie ist der eindeutig adressierbare Indikator, aus dem spätere Bewertungen aufgebaut werden. Ohne eindeutige Zuordnungen bleibt Wirkung sprachlich. Mit WÖk-IDs wird Wirkung technisch anschlussfähig, prüfbar, vergleichbar und versionierbar.</w:t>
+      </w:r>
+    </w:p>
+    <w:p>
+      <w:r>
+        <w:t>Der Leitgedanke dieses Kapitels lautet: Die WÖk-ID macht Wirkung adressierbar. Sie übersetzt den normativen Maßstab Mensch, Planet und Demokratie in eine strukturierte Daten- und Indikatorenlogik. Dieses Kapitel bewertet noch nicht. Es erklärt, wie Wirkungsindikatoren geordnet werden. Die Frage, wie Messwerte über Archetypen, Benchmarks, Skalen und Scorecards bewertet werden, folgt im nächsten methodischen Schritt.</w:t>
+      </w:r>
+    </w:p>
+    <w:p>
+      <w:pPr>
+        <w:pStyle w:val="Heading3"/>
+      </w:pPr>
+      <w:r>
+        <w:t>31.1 Funktion der WÖk-ID</w:t>
+      </w:r>
+    </w:p>
+    <w:p>
+      <w:r>
+        <w:t>Die WÖk-ID löst ein Grundproblem jeder Wirkungsmessung: Unterschiedliche Akteure sprechen über ähnliche Wirkungen, aber nicht in derselben Sprache. Ein Unternehmen berichtet Wasserverbrauch. Eine Behörde prüft Wasserentnahme. Ein Investor fragt nach Standortrisiko. Eine Kommune betrachtet lokale Resilienz. Eine Lieferkette dokumentiert Herkunft, Stressregion und Verbrauch. Ohne gemeinsame Ordnung können diese Informationen nebeneinanderstehen, ohne gemeinsam auswertbar zu werden.</w:t>
+      </w:r>
+    </w:p>
+    <w:p>
+      <w:r>
+        <w:t>Die WÖk-ID schafft eine eindeutige Adresse für einen Wirkungsindikator. Sie sagt nicht nur, dass „Wasser“ relevant ist. Sie klärt, welcher konkrete Aspekt gemeint ist: Wasserentnahme, Wasserverbrauch, Wasserstress, Wiederverwendung, Abwasserqualität, Standortbezug, Lieferkettenbezug oder Gesundheitswirkung. Sie klärt auch, auf welche Wirkungsdimension sich der Indikator bezieht, welche Datenquelle genutzt wird, welche Einheit gilt, welche Systemgrenze gesetzt wird, welcher Prüfstatus vorliegt und welche Version verwendet wird.</w:t>
+      </w:r>
+    </w:p>
+    <w:p>
+      <w:r>
+        <w:t>Damit wird Wirkung nicht nur beschrieben, sondern geordnet. Eine WÖk-ID kann etwa Produkt-CO2-Fußabdruck, Living-Wage-Abdeckung, Arbeitsschutz, Kinder- und Zwangsarbeitsausschluss, Gender Pay Gap, Produktsicherheit, Datenschutz, Gebäudeenergiebedarf, Stadtgrün, Steuertransparenz, algorithmische Prüfpflicht oder Lieferkettentransparenz adressieren. Die Beispiele zeigen: Die WÖk-ID ist nicht auf ökologische Indikatoren begrenzt. Sie ordnet Wirkung entlang der gesamten Trias Mensch, Planet und Demokratie.</w:t>
+      </w:r>
+    </w:p>
+    <w:p>
+      <w:r>
+        <w:t>Ihre Funktion liegt in fünf Bereichen. Erstens standardisiert sie Sprache. Unterschiedliche Akteure können dieselbe Wirkungseinheit meinen. Zweitens ermöglicht sie Vergleichbarkeit. Produkte, Dienstleistungen, Unternehmen, Kapitalflüsse, Immobilien, öffentliche Maßnahmen und Tätigkeiten können nicht identisch bewertet werden, aber entlang einer gemeinsamen Logik. Drittens erhöht sie Prüfbarkeit. Prüfende können nachvollziehen, welche Daten, Grenzen und Quellen verwendet wurden. Viertens ermöglicht sie digitale Verarbeitung. Register, Datenräume, Beschaffungssysteme, Berichte und spätere Entscheidungslogiken können Wirkungsinformationen maschinenlesbar verarbeiten. Fünftens schafft sie Lernfähigkeit, weil jede ID versioniert, angepasst, erweitert oder ersetzt werden kann.</w:t>
+      </w:r>
+    </w:p>
+    <w:p>
+      <w:r>
+        <w:t>Für technische Systeme wird der Prefix WOK verwendet, weil Umlaute in Datenbanken, Schnittstellen, Registern und internationalen Datenräumen problematisch sein können. Im Fließtext bleibt WÖk-ID die fachliche Schreibweise. Diese Unterscheidung trennt Sprache und technische Interoperabilität.</w:t>
+      </w:r>
+    </w:p>
+    <w:p>
+      <w:r>
+        <w:t>Wichtig ist die Grenze dieses Kapitels: Die WÖk-ID bewertet noch nicht. Sie macht Bewertung möglich. Sie beantwortet die Frage: Welcher Indikator ist gemeint? Der konkrete Messwert, die Benchmark, die spätere Einordnung, die Zusammenführung in Scorecards und die daraus folgende Entscheidungswirkung gehören zu den nächsten Schritten.</w:t>
+      </w:r>
+    </w:p>
+    <w:p>
+      <w:pPr>
+        <w:pStyle w:val="Heading3"/>
+      </w:pPr>
+      <w:r>
+        <w:t>31.2 SDGs, SDG+ und der Zielbezug der WÖk-ID</w:t>
+      </w:r>
+    </w:p>
+    <w:p>
+      <w:r>
+        <w:t>Eine WÖk-ID ist keine beliebige technische Kennziffer. Sie verbindet einen messbaren Wirkungsindikator mit einem normativen Zielbezug. Genau dadurch unterscheidet sie sich von einer reinen Daten-ID, einer Reporting-Kennzahl oder einem technischen Registereintrag.</w:t>
+      </w:r>
+    </w:p>
+    <w:p>
+      <w:r>
+        <w:t>Die grundlegende Begründung, warum die Wirkungsökonomie die Sustainable Development Goals als globalen Referenzrahmen nutzt und zugleich zu SDG+ erweitert, wurde im Exkurs am Ende von Teil IV entfaltet. Dieses Kapitel knüpft daran methodisch an. Es fragt nicht mehr, warum ein globaler Zielrahmen nötig ist, sondern wie dieser Zielrahmen in eine adressierbare Indikatorenarchitektur übersetzt werden kann.</w:t>
+      </w:r>
+    </w:p>
+    <w:p>
+      <w:r>
+        <w:t>Die SDGs bilden dafür den wichtigsten globalen Anschlussrahmen. Sie wurden als Teil der Agenda 2030 von den Mitgliedstaaten der Vereinten Nationen beschlossen und beschreiben zentrale Entwicklungs-, Sozial-, Umwelt- und Institutionenziele: Armut, Hunger, Gesundheit, Bildung, Wasser, Energie, Arbeit, Infrastruktur, Ungleichheit, nachhaltige Städte, verantwortliche Produktion, Klima, Meere, Biodiversität, Frieden, Institutionen und Partnerschaften.</w:t>
+      </w:r>
+    </w:p>
+    <w:p>
+      <w:r>
+        <w:t>Die SDGs sind damit nicht wertneutral. Sie enthalten normative Zielsetzungen. Aber sie sind nicht parteiideologisch im engen Sinn. Sie sind kein Programm einer bestimmten Wirtschaftsform, keiner bestimmten Partei und keines einzelnen Staates. Sie bilden einen multilateralen Zielraum, an den sehr unterschiedliche politische, ökonomische und kulturelle Systeme anschließen können. Genau diese Breite macht sie für die Wirkungsökonomie relevant.</w:t>
+      </w:r>
+    </w:p>
+    <w:p>
+      <w:r>
+        <w:t>Die Wirkungsökonomie übernimmt die SDGs jedoch nicht als vollständige Steuerungsarchitektur. Die SDGs beschreiben Zielräume. Sie sagen noch nicht ausreichend, wie Wirkung gemessen, gewichtet, nicht kompensiert, bepreist, besteuert, kapitalbezogen bewertet, in Beschaffung übersetzt oder in Rückkopplung überführt wird. Sie sind deshalb Ausgangspunkt, nicht Endpunkt der Wirkungsökonomie.</w:t>
+      </w:r>
+    </w:p>
+    <w:p>
+      <w:r>
+        <w:t>Hinzu kommt: Die SDGs sind längst nicht nur ein politischer Zielrahmen. Sie sind Teil der globalen Nachhaltigkeits-, Reporting- und Finanzmarktsprache geworden. Viele große, international berichtende und kapitalmarktorientierte Unternehmen beziehen sich in Nachhaltigkeitsberichten, Strategiedokumenten, Wesentlichkeitsanalysen oder ESG-Kommunikation auf die SDGs. Das geschieht nicht überall gleich tief und nicht immer überzeugend. Aber die SDGs haben sich als gemeinsame Referenzsprache etabliert.</w:t>
+      </w:r>
+    </w:p>
+    <w:p>
+      <w:r>
+        <w:t>Auch ESG-Ratings bewerten Unternehmen nicht schlicht „nach den SDGs“. Sie bewerten in der Regel Umwelt-, Sozial- und Governance-Risiken, Branchenexpositionen, Managementsysteme, Kontroversen und finanziell relevante Nachhaltigkeitsrisiken. Dennoch überschneiden sich viele dieser Bewertungsfelder mit SDG-nahen Wirkungsräumen: Klima, Wasser, Arbeit, Menschenrechte, Gesundheit, Biodiversität, Lieferketten, Governance, Korruption, soziale Stabilität und institutionelle Qualität. MSCI beschreibt seine ESG Ratings etwa als Messung der Resilienz von Unternehmen gegenüber finanziell relevanten, branchenspezifischen Nachhaltigkeitsrisiken und -chancen; Sustainalytics beschreibt seine ESG Risk Ratings als Bewertung der Exposition gegenüber materiellen ESG-Risiken und des Managements dieser Risiken.</w:t>
+      </w:r>
+    </w:p>
+    <w:p>
+      <w:r>
+        <w:t>Damit werden SDG-nahe Themen im Finanzmarkt faktisch zu Risiko-, Resilienz- und Bewertungsfaktoren. Wasserstress ist nicht nur ein Nachhaltigkeitsthema, sondern ein Produktions- und Lieferkettenrisiko. Klimawandel ist nicht nur ein Umweltziel, sondern ein Standort-, Versicherungs-, Kapital- und Transitionsrisiko. Menschenrechte sind nicht nur ein ethisches Anliegen, sondern ein Haftungs-, Reputations- und Beschaffungsrisiko. Biodiversitätsverlust ist nicht nur Naturschutz, sondern ein Risiko für Ernährung, Rohstoffe, Gesundheit und Systemstabilität.</w:t>
+      </w:r>
+    </w:p>
+    <w:p>
+      <w:r>
+        <w:t>Genau hier setzt die WÖk-ID an. Sie übersetzt den globalen Zielraum der SDGs und die Erweiterung durch SDG+ in eine adressierbare Indikatorenlogik. Eine WÖk-ID beantwortet daher nicht nur die Frage: Welcher Indikator wird gemessen? Sie beantwortet auch: Auf welchen Zielraum bezieht sich dieser Indikator?</w:t>
+      </w:r>
+    </w:p>
+    <w:p>
+      <w:r>
+        <w:t>Ein CO2-Indikator kann etwa auf SDG 13, Klima, bezogen werden. Ein Wasserstress-Indikator kann SDG 6, sauberes Wasser, und SDG 12, nachhaltige Produktion, berühren. Ein Living-Wage-Indikator kann mit SDG 8, menschenwürdige Arbeit, und SDG 10, weniger Ungleichheit, verbunden sein. Ein Biodiversitätsindikator kann SDG 15 oder SDG 14 betreffen. Ein Korruptions- oder Transparenzindikator kann an SDG 16 anschließen. Diese Zuordnung macht den Zielbezug sichtbar, ersetzt aber noch keine Bewertung.</w:t>
+      </w:r>
+    </w:p>
+    <w:p>
+      <w:r>
+        <w:t>SDG+ erweitert diese Logik um jene Wirkungsräume, die für die Wirkungsökonomie besonders wichtig sind, in der klassischen SDG-Systematik aber nicht tief genug operationalisiert werden: Demokratie, Rechtsstaatlichkeit, Medienqualität, Diskursfähigkeit, digitale Selbstbestimmung, algorithmische Fairness, Plattformmacht, institutionelles Vertrauen und Schutz vor Manipulation.</w:t>
+      </w:r>
+    </w:p>
+    <w:p>
+      <w:r>
+        <w:t>Diese Erweiterung ist notwendig, weil Wirkung im 21. Jahrhundert nicht nur ökologische und soziale Zustände betrifft. Auch öffentliche Wahrheit, digitale Öffentlichkeit, Plattformlogiken, algorithmische Entscheidungen, Desinformation, Medienqualität und demokratische Resilienz verändern reale Zustände. Eine Wirkung kann nicht als vollständig positiv gelten, wenn sie ökologische oder soziale Vorteile erzeugt, aber demokratische Korrekturfähigkeit beschädigt.</w:t>
+      </w:r>
+    </w:p>
+    <w:p>
+      <w:r>
+        <w:t>Der Zielbezug der WÖk-ID besteht deshalb aus zwei Ebenen. Die erste Ebene ist der Anschluss an die SDGs als global etablierter Referenzrahmen. Die zweite Ebene ist SDG+ als wirkungsökonomische Erweiterung um demokratie-, medien-, daten- und digitalitätsbezogene Wirkungsräume. Zusammen verbinden sie internationale Anschlussfähigkeit mit dem normativen Kern der Wirkungsökonomie: Mensch, Planet und Demokratie.</w:t>
+      </w:r>
+    </w:p>
+    <w:p>
+      <w:r>
+        <w:t>Wichtig bleibt die Grenze: Eine WÖk-ID ist noch keine Entscheidung. Sie bewertet nicht selbst, ob eine Wirkung gut, schlecht, kritisch oder transformativ ist. Sie ordnet den Indikator, den Zielbezug, die Wirkungsdimension und die spätere Anschlussfähigkeit an Scorecards, Datenquellen, Benchmarks und Prüfverfahren. Die Bewertung folgt erst in den nächsten methodischen Schritten.</w:t>
+      </w:r>
+    </w:p>
+    <w:p>
+      <w:r>
+        <w:t>So wird aus den SDGs kein bloßes Symbol und aus SDG+ keine zusätzliche Zieldekoration. Beide werden zu einer strukturierten Referenzlogik für Wirkungsdaten. Die WÖk-ID macht sichtbar, welcher Wirkungsaspekt gemeint ist, welchem Zielraum er zugeordnet wird und wie er später vergleichbar, prüfbar und rückkoppelbar werden kann.</w:t>
+      </w:r>
+    </w:p>
+    <w:p>
+      <w:pPr>
+        <w:pStyle w:val="Heading3"/>
+      </w:pPr>
+      <w:r>
+        <w:t>31.3 Aufbau einer WÖk-ID</w:t>
+      </w:r>
+    </w:p>
+    <w:p>
+      <w:r>
+        <w:t>Eine WÖk-ID besteht aus mehreren Ebenen. Sie ist keine bloße laufende Nummer. Sie bildet ab, welcher Wirkungsraum, welche Indikatorfamilie, welche Einheit, welche Datenquelle, welche Systemgrenze, welcher Prüfstatus und welche Version gemeint sind.</w:t>
+      </w:r>
+    </w:p>
+    <w:p>
+      <w:r>
+        <w:t>Die genaue technische Ausgestaltung kann sich weiterentwickeln. Für das Verständnis reicht hier die Grundlogik: Eine WÖk-ID verbindet eine Wirkungsdimension mit einem Zielbezug, einer Aktivitätsordnung, einer Indikatorfamilie und einer Datenlogik. Damit wird ein Indikator eindeutig adressierbar.</w:t>
+      </w:r>
+    </w:p>
+    <w:p>
+      <w:r>
+        <w:t>Tabelle 31-1: Grundelemente einer WÖk-ID</w:t>
+      </w:r>
+    </w:p>
+    <w:p>
+      <w:r>
+        <w:t>Diese Struktur verhindert, dass scheinbar gleiche Begriffe unterschiedliche Dinge meinen. „CO2“ kann Produkt-CO2, Standortemission, Scope-1-Emission, Scope-3-Lieferkettenemission, Nutzungsphase oder Entsorgung betreffen. „Wasser“ kann Entnahme, Verbrauch, Wasserstress, Abwasserqualität oder ökologische Gewässerwirkung meinen. „Arbeit“ kann Beschäftigung, Lohnniveau, Arbeitszeit, Sicherheit, Mitbestimmung, Kinderarbeit, Zwangsarbeit oder psychische Belastung meinen. Eine WÖk-ID erzwingt diese Präzisierung.</w:t>
+      </w:r>
+    </w:p>
+    <w:p>
+      <w:r>
+        <w:t>Die WÖk-ID trennt außerdem Indikator und Bewertung. Ein Messwert wird nicht schon dadurch gut oder schlecht, dass er eine ID erhält. Die ID sagt: Dieser Wert gehört zu diesem Indikator, in diesem Wirkungsfeld, mit dieser Einheit und dieser Systemgrenze. Ob der Wert später positiv, neutral, kritisch oder schädlich bewertet wird, hängt von Archetyp, Benchmark, Schwellenwert, Kontext, Datenqualität und Scorecard ab.</w:t>
+      </w:r>
+    </w:p>
+    <w:p>
+      <w:r>
+        <w:t>Diese Trennung ist methodisch wichtig. Ohne sie würde die Messarchitektur mit der Bewertungsarchitektur verschwimmen. Dann wäre nicht mehr klar, ob eine Änderung am Score aus realer Wirkungsverbesserung stammt oder aus einer Änderung der Zuordnung, der Einheit, des Benchmarks oder der Systemgrenze. Die WÖk-ID hält diese Ebenen auseinander.</w:t>
+      </w:r>
+    </w:p>
+    <w:p>
+      <w:pPr>
+        <w:pStyle w:val="Heading3"/>
+      </w:pPr>
+      <w:r>
+        <w:t>31.4 SDG, SDG+, NACE, ESRS und GRI</w:t>
+      </w:r>
+    </w:p>
+    <w:p>
+      <w:r>
+        <w:t>Die Wirkungsökonomie beginnt nicht bei null. Sie nutzt bestehende internationale, europäische und branchenspezifische Ordnungen, erweitert sie aber um eine eigene Wirkungslogik. Die WÖk-ID ist deshalb keine geschlossene Sondernummer, sondern eine Anschlussstruktur. Sie verbindet die normative Trias Mensch, Planet und Demokratie mit vorhandenen Ziel-, Branchen- und Berichtssystemen.</w:t>
+      </w:r>
+    </w:p>
+    <w:p>
+      <w:r>
+        <w:t>Die SDGs liefern den globalen Zielrahmen nachhaltiger Entwicklung. Sie machen sichtbar, dass Armut, Gesundheit, Bildung, Geschlechtergerechtigkeit, Wasser, Energie, Arbeit, Ungleichheit, Städte, Konsum, Klima, Biodiversität, Frieden und Institutionen zusammengehören. Für die Wirkungsökonomie sind die SDGs ein globaler Kompass, aber noch keine ausreichende Messarchitektur. Sie benennen Zielräume, ersetzen jedoch nicht die Frage, wie konkrete Wirkungen in Daten, Indikatoren, Rückkopplung und Entscheidung übersetzt werden.</w:t>
+      </w:r>
+    </w:p>
+    <w:p>
+      <w:r>
+        <w:t>Die SDG-Indikatoren der Vereinten Nationen schaffen den technischen Anschluss an Ziel- und Unterzielbezüge. Sie zeigen, dass globale Ziele nicht nur politisch formuliert, sondern durch Indikatoren beobachtbar gemacht werden sollen. Auch hier gilt: Der globale SDG-Indikatorrahmen ist wichtig, aber nicht deckungsgleich mit der WÖk-ID. Viele WÖk-Indikatoren brauchen produkt-, unternehmens-, lieferketten-, kapital-, kommunal- oder medienbezogene Präzisierung. Die SDG-Indikatoren liefern Anschluss, nicht vollständige operative Steuerung.</w:t>
+      </w:r>
+    </w:p>
+    <w:p>
+      <w:pPr>
+        <w:pStyle w:val="Heading3"/>
+      </w:pPr>
+      <w:r>
+        <w:t>Quellenanker: Kapitel 32 - Benchmarks, Skalen und Scorecards</w:t>
+      </w:r>
+    </w:p>
+    <w:p>
+      <w:r>
+        <w:t>Interne Quelle: referenz/kapitel-032-benchmarks-skalen-und-scorecards/index.html</w:t>
+      </w:r>
+    </w:p>
+    <w:p>
+      <w:r>
+        <w:t>Kapitel 31 hat die WÖk-ID als Ordnungseinheit eingeführt. Sie macht Wirkungsindikatoren adressierbar, prüfbar und versionierbar. Damit ist jedoch noch keine Bewertung entstanden. Ein Messwert allein sagt nicht, ob eine Wirkung gut, schwach, riskant, durchschnittlich, schädlich oder transformativ ist. Ein Wasserverbrauch, eine Emissionsmenge, eine Unfallquote, ein Living-Wage-Anteil, ein Recyclingwert oder eine Transparenzkennzahl erhalten ihre Bedeutung erst durch Vergleich, Kontext und Schwellenwert.</w:t>
+      </w:r>
+    </w:p>
+    <w:p>
+      <w:r>
+        <w:t>Dieses Kapitel erklärt, wie aus Daten vergleichbare Bewertungen entstehen. Es führt Benchmarks, Wirkungsskalen und Scorecards als methodische Brücke zwischen Rohdaten und Wirkungseinschätzung ein. Scorecards sind keine moralischen Etiketten. Sie sind strukturierte Übersetzungen von Wirkungsdaten in nachvollziehbare Bewertung.</w:t>
+      </w:r>
+    </w:p>
+    <w:p>
+      <w:r>
+        <w:t>Die verbindliche Grenze bleibt klar: Dieses Kapitel erklärt noch nicht die Reverse Merit Order im Detail, keine Produktsteuer, keine konkrete Steuermechanik und keine rechtliche Anwendung. Es geht um die Bewertungslogik zwischen Daten, Schwellenwerten, Kontext und Wirkungsklassen.</w:t>
+      </w:r>
+    </w:p>
+    <w:p>
+      <w:pPr>
+        <w:pStyle w:val="Heading3"/>
+      </w:pPr>
+      <w:r>
+        <w:t>32.1 Wirkungsskala von negativ bis transformativ</w:t>
+      </w:r>
+    </w:p>
+    <w:p>
+      <w:r>
+        <w:t>Eine Wirkungsskala übersetzt Messwerte in Bedeutung. Sie sagt nicht nur, dass ein Wert hoch oder niedrig ist. Sie ordnet ein, ob dieser Wert eine negative, neutrale, positive oder transformative Wirkung anzeigt. Ohne Skala bleiben Daten schwer verständlich. Mit einer schlechten Skala entsteht Scheingenauigkeit. Mit einer guten Skala wird sichtbar, in welchem Wirkungsbereich ein Zustand liegt.</w:t>
+      </w:r>
+    </w:p>
+    <w:p>
+      <w:r>
+        <w:t>Die Wirkungsökonomie arbeitet mit einer Skala von -3 bis +3. Der genaue Zuschnitt kann je nach Wirkungsfeld, Indikatorfamilie und Kontext variieren. Der Zweck bleibt gleich: Daten sollen nicht nur gesammelt, sondern in eine verständliche Wirkungsordnung überführt werden.</w:t>
+      </w:r>
+    </w:p>
+    <w:p>
+      <w:r>
+        <w:t>Tabelle 32-1: Wirkungsskala von -3 bis +3</w:t>
+      </w:r>
+    </w:p>
+    <w:p>
+      <w:r>
+        <w:t>Eine solche Skala ist kein bloßer Übersetzungsmechanismus. Sie macht sichtbar, dass Wirkung nicht nur „vorhanden“ oder „nicht vorhanden“ ist. Zwischen Schaden und Transformation liegen Zwischenstufen. Ein Wert kann noch problematisch sein, aber besser als ein destruktiver Ausgangszustand. Ein anderer Wert kann neutral sein, also keine relevante Verbesserung erzeugen. Wieder ein anderer kann positiv sein, aber noch nicht systemisch transformativ. Transformativ ist eine Wirkung erst dann, wenn sie nicht nur einen Einzelwert verbessert, sondern einen Zukunftspfad verändert, Regeneration ermöglicht, Risiken senkt oder positive Rückkopplungen erzeugt.</w:t>
+      </w:r>
+    </w:p>
+    <w:p>
+      <w:r>
+        <w:t>Die Skala schützt vor zwei Fehlern. Der erste Fehler wäre Schwarz-Weiß-Bewertung. Dann wird alles entweder gut oder schlecht. Diese Logik verfehlt Übergänge, Lernprozesse und Transformation. Der zweite Fehler wäre Beliebigkeit. Dann wird jeder kleine Fortschritt schon als nachhaltig oder positiv bezeichnet. Diese Logik entwertet echte Transformation.</w:t>
+      </w:r>
+    </w:p>
+    <w:p>
+      <w:r>
+        <w:t>Eine Wirkungsskala braucht daher klare Schwellen. Sie muss zeigen, wann ein Wert noch schädlich ist, wann er neutral wird, wann er positive Wirkung anzeigt und wann er transformativ wirkt. Diese Schwellen dürfen nicht aus Kommunikation oder Wunschdenken entstehen. Sie müssen aus Daten, wissenschaftlichen Referenzen, regulatorischen Standards, Branchenbenchmarks, Wirkungspfaden und normativen Mindestanforderungen abgeleitet werden.</w:t>
+      </w:r>
+    </w:p>
+    <w:p>
+      <w:r>
+        <w:t>Wichtig ist: Die Skala bewertet nicht den Menschen, der handelt. Sie bewertet eine Wirkung in einem definierten Wirkungsraum. Diese Trennung ist methodisch notwendig. Wer Wirkung misst, darf nicht moralisch etikettieren. Eine Score-Stufe sagt nicht: Eine Person ist gut oder schlecht. Sie sagt: Ein bestimmter Indikatorwert liegt in einem bestimmten Wirkungsbereich.</w:t>
+      </w:r>
+    </w:p>
+    <w:p>
+      <w:pPr>
+        <w:pStyle w:val="Heading3"/>
+      </w:pPr>
+      <w:r>
+        <w:t>32.2 Benchmarks nach Branche und Kontext</w:t>
+      </w:r>
+    </w:p>
+    <w:p>
+      <w:r>
+        <w:t>Benchmarks sind Vergleichsmaßstäbe. Sie beantworten die Frage: Womit wird ein Messwert verglichen? Ohne Benchmark bleibt ein Wert leer. Zehn Tonnen Emissionen können je nach Produkt, Branche, Menge, Standort und Lebenszyklus sehr hoch, moderat oder niedrig sein. Ein Wasserverbrauch kann in einer wasserreichen Region anders zu bewerten sein als in einer Stressregion. Ein Lohnwert kann je nach Lebenshaltungskosten, Arbeitszeit, Tarifbindung und Lieferkettenstufe unterschiedliche Bedeutung haben.</w:t>
+      </w:r>
+    </w:p>
+    <w:p>
+      <w:r>
+        <w:t>Die Wirkungsökonomie braucht deshalb Branchen- und Kontextbenchmarks. Ein Wert wird nicht abstrakt bewertet, sondern im Verhältnis zu Aktivität, Branche, Region, Systemgrenze und Wirkungsfeld. Die technischen Leitlinien der WÖk nennen sektorspezifische Referenzwerte, Archetypen und Benchmarks als methodische Grundlage, damit Messwerte nicht frei interpretiert werden, sondern in nachvollziehbare Bewertungsrahmen eingehen.</w:t>
+      </w:r>
+    </w:p>
+    <w:p>
+      <w:r>
+        <w:t>Branchenbenchmarks verhindern falsche Vergleichbarkeit. Eine Schule, ein Stahlwerk, ein Pflegeheim, ein Medienhaus, ein Textilprodukt, ein Wohngebäude, eine Bank und eine digitale Plattform erzeugen unterschiedliche Wirkungen. Sie dürfen nicht mit derselben Indikatorenmischung bewertet werden. Gleichwohl können sie über gemeinsame Wirkungsdimensionen verbunden werden: Mensch, Planet und Demokratie. Vergleichbarkeit entsteht also nicht durch Gleichsetzung, sondern durch geordnete Übersetzung.</w:t>
+      </w:r>
+    </w:p>
+    <w:p>
+      <w:r>
+        <w:t>Kontextbenchmarks verhindern ebenfalls Verzerrung. Ein niedriger Wasserverbrauch kann noch problematisch sein, wenn er in einem extrem wasserarmen Gebiet entsteht. Ein hoher Energiebedarf kann anders zu bewerten sein, wenn er unvermeidbare Grundversorgung sichert oder aus vermeidbarer Verschwendung stammt. Ein Beschäftigungswert kann positiv erscheinen, aber durch schlechte Arbeitsbedingungen, Gesundheitsrisiken oder fehlende Mitbestimmung relativiert werden. Ein emissionsarmer Prozess kann gesellschaftlich schädlich sein, wenn er auf Zwangsarbeit, Biodiversitätsverlust oder demokratisch problematischer Abhängigkeit beruht.</w:t>
+      </w:r>
+    </w:p>
+    <w:p>
+      <w:r>
+        <w:t>Benchmarks müssen daher mehrere Ebenen verbinden. Sie brauchen wissenschaftliche Referenzen, regulatorische Vorgaben, Branchenwerte, regionale Bedingungen, Lebenszyklusbezug, Mindeststandards und Transformationspfade. Ein guter Benchmark ist nicht nur Durchschnitt. Durchschnitt kann eine schlechte Realität stabilisieren. Wenn eine ganze Branche schädlich arbeitet, kann der Branchendurchschnitt nicht automatisch als neutral gelten. Der Benchmark muss sich an Wirkung orientieren, nicht nur an vorhandener Praxis.</w:t>
+      </w:r>
+    </w:p>
+    <w:p>
+      <w:r>
+        <w:t>Damit wird ein wichtiger Unterschied sichtbar: Ein statistischer Durchschnitt beschreibt, was üblich ist. Ein Wirkungsbenchmark beschreibt, was gemessen an Mensch, Planet und Demokratie tragfähig oder transformativ ist. Beide Informationen können nützlich sein. Sie dürfen aber nicht verwechselt werden.</w:t>
+      </w:r>
+    </w:p>
+    <w:p>
+      <w:pPr>
+        <w:pStyle w:val="Heading3"/>
+      </w:pPr>
+      <w:r>
+        <w:t>32.3 Scorecard-Aufbau</w:t>
+      </w:r>
+    </w:p>
+    <w:p>
+      <w:r>
+        <w:t>Eine Scorecard bündelt mehrere Indikatoren zu einer strukturierten Wirkungsbewertung. Sie besteht nicht aus zufällig ausgewählten Kennzahlen. Sie ordnet relevante WÖk-IDs, Datenquellen, Benchmarks, Schwellenwerte, Skalenlogik und Kontextinformationen zu einem Wirkungsfeld.</w:t>
+      </w:r>
+    </w:p>
+    <w:p>
+      <w:r>
+        <w:t>Der Aufbau einer Scorecard beginnt mit der Frage, was bewertet wird. Ein Produkt, eine Dienstleistung, eine Organisation, ein Kapitalfluss, eine Tätigkeit, ein Gebäude, eine Lieferkette oder eine öffentliche Maßnahme haben unterschiedliche Wirkungsprofile. Danach folgt die Auswahl der relevanten Indikatorfamilien. Je nach Wirkungsfeld können Klima, Wasser, Ressourcen, Arbeit, Gesundheit, Sicherheit, Bildung, Teilhabe, Transparenz, Medienqualität, Demokratie, Resilienz oder digitale Verantwortung relevant sein.</w:t>
+      </w:r>
+    </w:p>
+    <w:p>
+      <w:r>
+        <w:t>Im nächsten Schritt werden Messwerte erfasst. Diese Messwerte stammen aus Datenquellen, die im vorherigen Kapitel eingeführt wurden: Berichte, Audits, Lebenszyklusanalysen, amtliche Daten, Lieferkettendaten, Branchenwerte, wissenschaftliche Quellen, Sensorik oder qualifizierte Schätzungen. Danach werden die Werte gegen Benchmarks gelesen. Erst dieser Vergleich erlaubt die Übersetzung in eine Wirkungsskala.</w:t>
+      </w:r>
+    </w:p>
+    <w:p>
+      <w:r>
+        <w:t>Eine Scorecard enthält damit mindestens fünf Ebenen. Die erste Ebene ist der Indikator. Die zweite Ebene ist der Messwert. Die dritte Ebene ist der Benchmark. Die vierte Ebene ist die Übersetzung in eine Wirkungsskala. Die fünfte Ebene ist die systemische Einordnung: Welche Wirkung entsteht im Zusammenhang? Eine Scorecard ist deshalb mehr als ein Punkteschema. Sie ist ein geordnetes Bewertungsinstrument, das Daten, Kontext und normativen Maßstab verbindet.</w:t>
+      </w:r>
+    </w:p>
+    <w:p>
+      <w:r>
+        <w:t>Tabelle 32-2: Aufbau einer Scorecard</w:t>
+      </w:r>
+    </w:p>
+    <w:p>
+      <w:r>
+        <w:t>Scorecards müssen lesbar und prüfbar sein. Lesbarkeit bedeutet, dass Akteure verstehen, warum ein Wert zu einer bestimmten Bewertung führt. Prüfbarkeit bedeutet, dass Datenquelle, Einheit, Systemgrenze, Zeitraum, Benchmark, Bewertungslogik und Unsicherheit nachvollziehbar sind. Ohne Lesbarkeit entsteht Misstrauen. Ohne Prüfbarkeit entsteht Willkür.</w:t>
+      </w:r>
+    </w:p>
+    <w:p>
+      <w:r>
+        <w:t>Gleichzeitig darf eine Scorecard nicht vorgaukeln, jede Wirkung sei vollständig abgeschlossen bewertbar. Komplexe Wirkungen bleiben teilweise unsicher. Deshalb braucht jede Scorecard Platz für Datenqualität, Unsicherheitsgrad, methodische Annahmen, offene Punkte und Aktualisierungsstatus. Ein Score ohne Hinweis auf Datenqualität ist riskant. Er kann Präzision vortäuschen, wo nur grobe Annäherung vorliegt.</w:t>
+      </w:r>
+    </w:p>
+    <w:p>
+      <w:r>
+        <w:t>Scorecards übersetzen Wirkung in Bewertung, aber sie ersetzen kein Urteil. Sie sind Teil einer lernenden Architektur. Wenn neue Daten, bessere Benchmarks oder veränderte Systemzustände sichtbar werden, muss eine Scorecard angepasst werden können. Starrheit wäre hier ebenso falsch wie Beliebigkeit.</w:t>
+      </w:r>
+    </w:p>
+    <w:p>
+      <w:pPr>
+        <w:pStyle w:val="Heading3"/>
+      </w:pPr>
+      <w:r>
+        <w:t>32.4 Der Netto-Wirkungs-Index als operative Wirkungskennzahl</w:t>
+      </w:r>
+    </w:p>
+    <w:p>
+      <w:r>
+        <w:t>Der Netto-Wirkungs-Index, kurz NWI, ist die operative Kennzahl der Wirkungsökonomie für die Bewertung von Netto-Wirkung.</w:t>
+      </w:r>
+    </w:p>
+    <w:p>
+      <w:r>
+        <w:t>Er misst nicht einzelne Wirkung. Er misst auch nicht Transformation. Der NWI bündelt die bewertete Gesamtwirkung eines Produkts, einer Dienstleistung, einer Tätigkeit, eines Unternehmens, einer Investition, eines Gesetzes, eines Haushaltsprogramms oder einer öffentlichen Maßnahme in einem definierten Wirkungsraum.</w:t>
+      </w:r>
+    </w:p>
+    <w:p>
+      <w:r>
+        <w:t>Damit schließt der NWI die Lücke zwischen Einzeldaten und Steuerung. Einzelne Indikatoren zeigen Messwerte. Scorecards ordnen diese Messwerte Wirkungsfeldern zu. Benchmarks übersetzen sie in Bewertung. Der NWI führt diese Bewertung zu einer operativen Netto-Wirkungskennzahl zusammen.</w:t>
+      </w:r>
+    </w:p>
+    <w:p>
+      <w:r>
+        <w:t>Der NWI berücksichtigt positive und negative Wirkungen, Mindestbedingungen, Ausschlussindikatoren, Datenqualität, Unsicherheit, Zeitwirkung und Systemkontext. Er ist deshalb keine einfache Addition guter und schlechter Werte. Schwere negative Wirkungen in kritischen Feldern dürfen nicht durch gute Werte in anderen Feldern neutralisiert werden. Die Reverse Merit Order bleibt deshalb ein methodischer Kern des NWI.</w:t>
+      </w:r>
+    </w:p>
+    <w:p>
+      <w:r>
+        <w:t>Ein hoher NWI bedeutet: Der Bewertungsgegenstand erzeugt im definierten Wirkungsraum eine positive Netto-Wirkung. Ein niedriger oder negativer NWI bedeutet: Die Gesamtwirkung ist kritisch, schädlich oder nicht ausreichend tragfähig. Ein mittlerer NWI kann anzeigen, dass positive und negative Wirkungen nebeneinander bestehen, dass Datenqualität fehlt, dass Unsicherheit hoch ist oder dass Mindestbedingungen nicht stabil erfüllt sind.</w:t>
+      </w:r>
+    </w:p>
+    <w:p>
+      <w:r>
+        <w:t>Der NWI ist damit die Kennzahl für operative Vergleichbarkeit. Er kann in Produktbewertungen, Lieferketten, Investitionsentscheidungen, öffentlicher Beschaffung, Wirkungssteuern, Wirkungshaushalten, Unternehmenscontrolling und öffentlichen Programmen verwendet werden. Er beantwortet die Frage: Wie ist die Netto-Wirkung dieses Bewertungsgegenstands im Vergleich zu einem definierten Maßstab zu beurteilen?</w:t>
+      </w:r>
+    </w:p>
+    <w:p>
+      <w:r>
+        <w:t>Methodisch ist der NWI eine zusammengesetzte Kennzahl. Deshalb muss er besonders transparent konstruiert werden. Es muss sichtbar bleiben, welche Indikatoren einbezogen wurden, welche Gewichtung oder Engpasslogik gilt, welche Datenqualität vorliegt, welche Felder kritisch sind und welche Unsicherheiten bestehen. Eine zusammengesetzte Kennzahl darf Orientierung geben, aber sie darf die zugrunde liegenden Wirkungsprofile nicht verdecken.</w:t>
+      </w:r>
+    </w:p>
+    <w:p>
+      <w:r>
+        <w:t>Der NWI ersetzt deshalb keine Scorecard. Er verdichtet sie. Die Scorecard bleibt die prüfbare Struktur aus Bewertungsgegenstand, Klassifikation, SDG-/SDG+-Bezug, WÖk-IDs, Messwerten, Benchmarks, Archetypen, Einzelscores, Datenqualität, Ausschlussindikatoren, Prüfstatus und Version. Der NWI ist die daraus abgeleitete operative Netto-Wirkungskennzahl.</w:t>
+      </w:r>
+    </w:p>
+    <w:p>
+      <w:r>
+        <w:t>Ebenso ersetzt der NWI keine Lebenszyklusanalyse, keine ESRS-Berichterstattung, keine GRI-Offenlegung und kein Impact-Metriksystem. Solche Standards und Methoden liefern Daten, Systemgrenzen, Metriken, Berichtsinformationen oder Vergleichslogiken. Der NWI nutzt solche Informationen, ordnet sie aber in die Wirkungslogik von Mensch, Planet und Demokratie ein.</w:t>
+      </w:r>
+    </w:p>
+    <w:p>
+      <w:pPr>
+        <w:pStyle w:val="Heading3"/>
+      </w:pPr>
+      <w:r>
+        <w:t>Quellenanker: Kapitel 50 - Produktscorecards</w:t>
+      </w:r>
+    </w:p>
+    <w:p>
+      <w:r>
+        <w:t>Interne Quelle: referenz/kapitel-050-produktscorecards/index.html</w:t>
+      </w:r>
+    </w:p>
+    <w:p>
+      <w:r>
+        <w:t>Kapitel 48 hat Produkte als Wirkungsträger beschrieben. Kapitel 49 hat gezeigt, warum Preise realere Wirkungen sichtbar machen müssen. Zwischen Produktdaten und Preissignal steht eine methodische Frage: Wie wird aus vielen Daten eine nachvollziehbare Bewertung, ohne das Produkt auf eine einzige Zahl zu verkürzen?</w:t>
+      </w:r>
+    </w:p>
+    <w:p>
+      <w:r>
+        <w:t>Die Produktscorecard beantwortet diese Frage. Sie übersetzt Produktdaten in eine strukturierte Wirkungsbewertung. Sie baut auf den WÖk-IDs, Benchmarks, Skalen, Scorecards und der Reverse Merit Order auf, die in den methodischen Teilen eingeführt wurden. Im Unterschied zur allgemeinen Scorecard-Logik wird sie produktbezogen angewendet: auf Produktgruppe, Lebenszyklus, Nutzungskontext, Vorleistungen, Datenqualität, Prüfstatus und relevante Wirkungsfelder [I-K50-1; I-K50-2].</w:t>
+      </w:r>
+    </w:p>
+    <w:p>
+      <w:r>
+        <w:t>Eine Produktscorecard ist kein Werbesiegel. Sie ist keine moralische Auszeichnung und kein Kommunikationsetikett. Sie ist ein methodisches Bewertungsinstrument. Ihr Zweck besteht darin, Produktwirkung lesbar, prüfbar, vergleichbar und rückkopplungsfähig zu machen.</w:t>
+      </w:r>
+    </w:p>
+    <w:p>
+      <w:r>
+        <w:t>Der Leitgedanke lautet: Eine Produktscorecard übersetzt Produktdaten in eine nachvollziehbare Wirkungsbewertung, ohne das Produkt auf einen bloßen Zahlenwert zu verkürzen.</w:t>
+      </w:r>
+    </w:p>
+    <w:p>
+      <w:r>
+        <w:t>Für Produkte verdichtet die Scorecard Lebenszyklus, Lieferkette, Nutzung und Nachwirkung. Der FinalScore wird nicht als Durchschnitt gebildet, sondern durch die schwächste relevante Wirkung begrenzt [I-K50-5; I-K50-6].</w:t>
+      </w:r>
+    </w:p>
+    <w:p>
+      <w:r>
+        <w:t>Tabelle 50-1: Produkt-Scorecard als Muster</w:t>
+      </w:r>
+    </w:p>
+    <w:p>
+      <w:pPr>
+        <w:pStyle w:val="Heading3"/>
+      </w:pPr>
+      <w:r>
+        <w:t>50.1 Aufbau</w:t>
+      </w:r>
+    </w:p>
+    <w:p>
+      <w:r>
+        <w:t>Eine Produktscorecard beginnt mit der klaren Bestimmung des Bewertungsgegenstands. Es muss erkennbar sein, welches Produkt, welche Produktgruppe, welches Modell, welche Charge oder welche funktionale Einheit bewertet wird. Ohne diese Abgrenzung kann keine belastbare Aussage entstehen. Ein einzelnes Produktmodell kann anders wirken als eine ganze Produktfamilie. Eine Produktionscharge kann andere Daten haben als ein Jahresdurchschnitt. Eine Produktgruppe in einem Konzern kann deutlich andere Wirkung zeigen als der Konzernmittelwert.</w:t>
+      </w:r>
+    </w:p>
+    <w:p>
+      <w:r>
+        <w:t>Danach folgt die Klassifikation. Produktscorecards brauchen NACE, Produktgruppen, gegebenenfalls CPA, Zollcodes, Funktionsklassen oder andere Zuordnungen. Diese Klassifikation verhindert freie Einzelfallbewertung. Ein Apfel wird nicht mit Stahl verglichen. Ein Textilprodukt wird nicht wie ein digitaler Dienst behandelt. Ein Baustoff wird nicht wie ein Pflegeangebot gelesen. Jede Produktart braucht eine eigene Wirkungslogik, bleibt aber in der gemeinsamen Grammatik von Mensch, Planet und Demokratie anschlussfähig [I-K50-2; I-K50-4].</w:t>
+      </w:r>
+    </w:p>
+    <w:p>
+      <w:r>
+        <w:t>Der nächste Baustein sind relevante SDGs und SDG+-Felder. Sie stellen den normativen Bezug her. Ein Produkt kann auf Klima, Wasser, Gesundheit, Arbeit, Bildung, Gleichstellung, Ressourcen, Infrastruktur, Datenschutz, Medienqualität oder demokratische Stabilität wirken. Nicht jedes Produkt berührt jedes Feld mit gleicher Stärke. Die Scorecard muss daher die relevanten Wirkungsfelder auswählen und begründen.</w:t>
+      </w:r>
+    </w:p>
+    <w:p>
+      <w:r>
+        <w:t>Danach werden WÖk-IDs zugeordnet. Sie machen die einzelnen Indikatoren adressierbar. Eine WÖk-ID steht nicht für eine diffuse Nachhaltigkeitsbehauptung, sondern für einen konkreten Wirkungsindikator mit Einheit, Datenquelle, Systemgrenze, Prüfanforderung und Version. Erst dadurch wird eine Scorecard prüfbar.</w:t>
+      </w:r>
+    </w:p>
+    <w:p>
+      <w:r>
+        <w:t>Auf diese Indikatoren folgen Messwerte, Datenquellen und Datenqualität. Daten können aus Primärdaten, Audits, EPDs, ESRS- oder GRI-Berichten, Produktpässen, Lieferantendaten, Messungen, Registern, amtlichen Statistiken, Branchenwerten oder plausibilisierten Schätzungen stammen. Die Scorecard muss ausweisen, ob ein Wert geprüft, plausibilisiert, geschätzt, veraltet, unvollständig oder unsicher ist.</w:t>
+      </w:r>
+    </w:p>
+    <w:p>
+      <w:r>
+        <w:t>Dann kommen Benchmarks und Archetypen. Benchmarks geben den Vergleichsrahmen. Archetypen beschreiben die Bewertungsfunktion: lower is better, higher is better, near zero oder andere Wirkungslogiken. Ein niedriger CO2-Wert ist meist besser. Ein hoher Anteil existenzsichernder Löhne ist besser. Bei manchen Indikatoren ist nicht der höchste oder niedrigste Wert gut, sondern ein tragfähiger Bereich.</w:t>
+      </w:r>
+    </w:p>
+    <w:p>
+      <w:r>
+        <w:t>Aus Messwert, Benchmark und Archetyp entsteht ein Einzelscore. Die WÖk-Architektur nutzt dafür die Skala von -3 bis +3: von hoch schädlicher oder nicht akzeptabler Wirkung bis transformativ positiver Wirkung. Diese Skala darf nicht mechanisch gelesen werden. Ihre Aussagekraft hängt von Datenqualität, Systemgrenze, Kontext, Benchmark und Prüfung ab.</w:t>
+      </w:r>
+    </w:p>
+    <w:p>
+      <w:r>
+        <w:t>Schließlich folgt der FinalScore. Er fasst die relevanten Einzelbewertungen nach der festgelegten Logik zusammen und berücksichtigt Datenqualität, Ausschlussindikatoren und Reverse Merit Order. Er ist keine Durchschnittsnote. Er ist die steuerungsfähige Gesamtbewertung eines Produkts. Er zeigt, wo die stärkste positive Wirkung liegt, wo kritische Engpässe bestehen, welche Daten fehlen und welche Veränderung den größten Unterschied machen würde [I-K50-2; I-K50-3].</w:t>
+      </w:r>
+    </w:p>
+    <w:p>
+      <w:pPr>
+        <w:pStyle w:val="Heading3"/>
+      </w:pPr>
+      <w:r>
+        <w:t>50.2 Kernfelder</w:t>
+      </w:r>
+    </w:p>
+    <w:p>
+      <w:r>
+        <w:t>Eine Produktscorecard muss produktbezogen bleiben. Sie darf nicht jedes mögliche Feld gleich behandeln. Dennoch gibt es Kernfelder, die für viele Produktgruppen wiederkehren.</w:t>
+      </w:r>
+    </w:p>
+    <w:p>
+      <w:r>
+        <w:t>Das erste Kernfeld ist Klima und Energie. Es umfasst produktbezogene Emissionen, Energiebedarf, Emissionsintensität, Nutzungsemissionen und Lebenszyklusbezug. Bei manchen Produkten liegt der Schwerpunkt in der Herstellung, bei anderen in der Nutzung. Ein Gerät kann in der Herstellung aufwendig sein, aber in der Nutzung Energie sparen. Ein Baustoff kann hohe Prozess-Emissionen haben, aber lange Lebensdauer ermöglichen. Die Scorecard muss den relevanten Lebenszyklusabschnitt sichtbar machen.</w:t>
+      </w:r>
+    </w:p>
+    <w:p>
+      <w:r>
+        <w:t>Das zweite Kernfeld ist Wasser, Boden und Biodiversität. Ein Produkt kann geringe Klimaemissionen zeigen und dennoch in Wasserstressregionen problematisch sein. Es kann Bodenqualität, Landnutzung oder Biodiversität beeinträchtigen. Diese Felder verhindern, dass Klimawerte alle anderen planetaren Wirkungen überdecken [I-K50-3; I-K50-6].</w:t>
+      </w:r>
+    </w:p>
+    <w:p>
+      <w:r>
+        <w:t>Das dritte Kernfeld ist Material, Kreislauf und Ende des Lebenszyklus. Dazu gehören Materialintensität, Rezyklatanteil, Reparierbarkeit, Rücknahme, Langlebigkeit, Schadstofffreiheit, Recyclingfähigkeit und Abfallvermeidung. Ein Produkt mit niedrigem Kaufpreis und kurzer Lebensdauer kann im Score schwächer sein als ein teureres, langlebigeres und reparierbares Produkt, wenn der Lebenszyklus betrachtet wird.</w:t>
+      </w:r>
+    </w:p>
+    <w:p>
+      <w:r>
+        <w:t>Das vierte Kernfeld ist Arbeit und Menschenrechte. Existenzsichernde Löhne, Arbeitsschutz, Kinder- und Zwangsarbeitsausschluss, Arbeitszeit, Mitbestimmung, Diskriminierungsfreiheit, Sicherheit und Lieferkettenrisiken gehören zu den zentralen Indikatoren. Dieses Feld ist besonders wichtig, weil schwere soziale Schäden nicht durch gute ökologische Werte ausgeglichen werden dürfen [I-K50-6; E-K50-4].</w:t>
+      </w:r>
+    </w:p>
+    <w:p>
+      <w:r>
+        <w:t>Das fünfte Kernfeld ist Gesundheit und Produktsicherheit. Es betrifft Schadstoffe, Sicherheit, ergonomische Wirkung, psychische Wirkung, Barrierefreiheit, Ernährungswirkung, Lärm, Luftqualität oder andere gesundheitliche Zustandsveränderungen. Je nach Produktgruppe kann dieses Feld sehr unterschiedlich ausfallen.</w:t>
+      </w:r>
+    </w:p>
+    <w:p>
+      <w:r>
+        <w:t>Das sechste Kernfeld ist Daten, digitale Wirkung und Demokratiebezug, soweit das Produkt digitale Funktionen, algorithmische Steuerung, Kommunikation, Plattformanbindung oder personenbezogene Daten berührt. Nicht jedes Produkt hat ein demokratisches Wirkungsfeld. Aber digitale Produkte, Medienprodukte, vernetzte Geräte, KI-gestützte Dienste oder Kommunikationsinfrastrukturen können Wirkung auf Selbstbestimmung, Manipulationsrisiken, Transparenz, Datenschutz und öffentliche Resonanz erzeugen.</w:t>
+      </w:r>
+    </w:p>
+    <w:p>
+      <w:r>
+        <w:t>Das siebte Kernfeld ist Resilienz und Versorgung. Manche Produkte sind relevant für kritische Funktionen: Gesundheit, Energie, Wasser, Ernährung, Kommunikation, Mobilität, Pflege, Sicherheit, Verwaltung oder Bildung. Ein Produkt kann deshalb nicht nur nach Einzelwirkung, sondern auch nach seiner Bedeutung für Systemstabilität gelesen werden.</w:t>
+      </w:r>
+    </w:p>
+    <w:p>
+      <w:r>
+        <w:t>Diese Kernfelder sind keine starre Liste für jede Produktgruppe. Sie bilden eine Suchordnung. Die Scorecard muss auswählen, was relevant ist, und offenlegen, warum bestimmte Felder einbezogen oder ausgeschlossen wurden. Produktscorecards dürfen keine Gleichmacherei zwischen Produktgruppen erzeugen. Ein Lebensmittel hat andere Kernfelder als ein Textil, ein Arzneimittel, ein Baustoff, ein Smartphone, eine Software oder eine Wärmepumpe. Die methodische Grammatik bleibt gleich. Die relevanten Felder unterscheiden sich.</w:t>
+      </w:r>
+    </w:p>
+    <w:p>
+      <w:pPr>
+        <w:pStyle w:val="Heading3"/>
+      </w:pPr>
+      <w:r>
+        <w:t>50.3 FinalScore</w:t>
+      </w:r>
+    </w:p>
+    <w:p>
+      <w:r>
+        <w:t>Der FinalScore ist die zusammengeführte Wirkungsbewertung eines Produkts. Er ist notwendig, weil Märkte, Unternehmen, Handel, öffentliche Stellen und Kund:innen nicht mit unüberschaubaren Einzeldaten arbeiten können. Sie brauchen eine verständliche Gesamtinformation. Gleichzeitig darf diese Gesamtinformation kritische Schäden nicht verdecken.</w:t>
+      </w:r>
+    </w:p>
+    <w:p>
+      <w:r>
+        <w:t>Deshalb ist der FinalScore kein Durchschnitt. Er entsteht nach Anwendung von Benchmarks, Einzelscores, Datenqualität, Ausschlussindikatoren und Reverse Merit Order. Diese Logik unterscheidet ihn von vielen klassischen Ratings. In klassischen Ratings können positive Werte in einem Feld negative Werte in einem anderen Feld teilweise ausgleichen. Die Wirkungsökonomie begrenzt diese Verrechnung. Ein Produkt mit guter CO2-Bilanz und Kinderarbeit wird nicht positiv. Ein Produkt mit hohem Rezyklatanteil und schwerem Wasserstress wird nicht unproblematisch. Ein Produkt mit guter Energieeffizienz und gravierenden Gesundheitsrisiken bleibt kritisch [I-K50-2; I-K50-6].</w:t>
+      </w:r>
+    </w:p>
+    <w:p>
+      <w:r>
+        <w:t>Der FinalScore zeigt daher nicht nur eine Gesamtklasse. Er zeigt einen Engpass. Er beantwortet: Welches Feld begrenzt die Gesamtwirkung? Welche Daten fehlen? Wo liegt das größte Risiko? Welche Verbesserung würde die Produktwirkung am stärksten verändern? Diese Informationen machen den FinalScore auch für Unternehmen nützlich. Er ist nicht nur ein Marktsignal. Er ist ein Innovationssignal.</w:t>
+      </w:r>
+    </w:p>
+    <w:p>
+      <w:r>
+        <w:t>Ein FinalScore muss Datenqualität enthalten. Ein Score mit geprüften Primärdaten hat eine andere Aussagekraft als ein Score mit Standardwerten oder Schätzungen. Ein Produkt mit Datenlücken darf nicht besser wirken als ein Produkt, das Risiken transparent macht. Deshalb gehören Datenqualitätsklassen, Prüfstatus, Unsicherheitsklasse und Version in die Produktscorecard [I-K50-1; I-K50-2].</w:t>
+      </w:r>
+    </w:p>
+    <w:p>
+      <w:r>
+        <w:t>Der FinalScore muss außerdem kontextsensibel sein. Ein Wasserwert hat in einer wasserarmen Region eine andere Bedeutung als in einer Region ohne Wasserstress. Ein Transportweg ist nicht isoliert zu bewerten, wenn Lagerung, Haltbarkeit, Verderb, Kühlung und Produktionsbedingungen mitwirken. Ein Material kann in einer Branche alternativlos sein, in einer anderen vermeidbar. Ein digitales Produkt kann geringe materielle Wirkung haben und dennoch Daten-, Manipulations- oder Energieeffekte erzeugen. Kontextsensibilität schützt vor falscher Einfachheit.</w:t>
+      </w:r>
+    </w:p>
+    <w:p>
+      <w:r>
+        <w:t>Gleichzeitig darf Kontext nicht als Ausrede dienen. Wenn jede Produktwirkung relativiert wird, verliert die Scorecard ihre Orientierungsfunktion. Kontextsensibilität bedeutet nicht Beliebigkeit. Sie bedeutet nachvollziehbare Einordnung. Ein Score muss erklären, warum ein Wert so bewertet wird, welche Vergleichsgruppe gilt, welcher Benchmark genutzt wurde und welche Systemgrenze gesetzt ist.</w:t>
+      </w:r>
+    </w:p>
+    <w:p>
+      <w:pPr>
+        <w:pStyle w:val="Heading3"/>
+      </w:pPr>
+      <w:r>
+        <w:t>50.4 Grenzen und Sonderfälle</w:t>
+      </w:r>
+    </w:p>
+    <w:p>
+      <w:r>
+        <w:t>Produktscorecards sind notwendige Instrumente, aber sie haben Grenzen. Diese Grenzen müssen offen benannt werden, damit keine Scheingenauigkeit entsteht.</w:t>
+      </w:r>
+    </w:p>
+    <w:p>
+      <w:r>
+        <w:t>Die erste Grenze liegt in der Datenlage. Nicht alle Produktwirkungen sind mit derselben Präzision erfassbar. Manche Daten liegen als geprüfte Primärdaten vor. Andere stammen aus Lieferantenangaben, Branchenwerten, Lebenszyklusdatenbanken oder Schätzungen. Eine Scorecard muss diese Unterschiede sichtbar machen. Sie darf einen geschätzten Wert nicht wie einen geprüften Wert behandeln.</w:t>
+      </w:r>
+    </w:p>
+    <w:p>
+      <w:r>
+        <w:t>Die zweite Grenze liegt in der Systemgrenze. Wird nur Herstellung betrachtet oder der ganze Lebenszyklus? Gehören Nutzung und Entsorgung dazu? Werden Vorprodukte einbezogen? Wie werden Nebenprodukte, Recycling und Mehrfachnutzung behandelt? Systemgrenzen entscheiden über Aussagekraft. ISO-Lebenszyklusnormen zeigen, wie wichtig Ziel, Untersuchungsrahmen, Systemgrenze und Datenqualität für eine belastbare Bewertung sind.</w:t>
+      </w:r>
+    </w:p>
+    <w:p>
+      <w:r>
+        <w:t>Die dritte Grenze liegt in Sonderfällen. Manche Produkte haben sehr lange Nutzungsdauern. Andere sind einmalig. Manche sind Teil eines Systems, etwa Bauprodukte, Medizinprodukte, Softwaremodule oder Infrastrukturkomponenten. Manche Produkte entfalten ihre Hauptwirkung erst durch Nutzung. Andere wirken vor allem durch Herstellung oder Rohstoffe. Die Scorecard muss solche Fälle abbilden können, ohne für jede Produktart eine völlig neue Sprache zu erfinden.</w:t>
+      </w:r>
+    </w:p>
+    <w:p>
+      <w:pPr>
+        <w:pStyle w:val="Heading3"/>
+      </w:pPr>
+      <w:r>
+        <w:t>Quellenanker: Wirkungsökonomie · WÖk-IDs · https://wirkungsoekonomie.de/werkzeuge/woek-ids/ · Druckdatum: 24.05.2026</w:t>
+      </w:r>
+    </w:p>
+    <w:p>
+      <w:r>
+        <w:t>Interne Quelle: werkzeuge/woek-ids/index.html</w:t>
+      </w:r>
+    </w:p>
+    <w:p>
+      <w:r>
+        <w:t>Methodenregister</w:t>
+      </w:r>
+    </w:p>
+    <w:p>
+      <w:r>
+        <w:t>Indikatorenarchitektur der Wirkungsökonomie.</w:t>
+      </w:r>
+    </w:p>
+    <w:p>
+      <w:r>
+        <w:t>WÖk-IDs verbinden Referenzrahmen, Datenquellen, Einheiten, Schwellen, Versionen und Prüfstatus.</w:t>
+      </w:r>
+    </w:p>
+    <w:p>
+      <w:r>
+        <w:t>Onlinefassung</w:t>
+      </w:r>
+    </w:p>
+    <w:p>
+      <w:r>
+        <w:t>Du liest die Onlinefassung</w:t>
+      </w:r>
+    </w:p>
+    <w:p>
+      <w:r>
+        <w:t>Diese Seite ist der öffentliche Einstieg in die Methodik. Vertiefungen, Downloads und Arbeitsmaterial stehen weiter unten gesammelt bereit.</w:t>
+      </w:r>
+    </w:p>
+    <w:p>
+      <w:r>
+        <w:t>Funktion</w:t>
+      </w:r>
+    </w:p>
+    <w:p>
+      <w:r>
+        <w:t>Was es leistet #</w:t>
+      </w:r>
+    </w:p>
+    <w:p>
+      <w:r>
+        <w:t>WÖk-IDs verbinden Referenzrahmen, Datenquellen, Einheiten, Schwellen, Versionen und Prüfstatus.</w:t>
+      </w:r>
+    </w:p>
+    <w:p>
+      <w:r>
+        <w:t>Anwendung</w:t>
+      </w:r>
+    </w:p>
+    <w:p>
+      <w:r>
+        <w:t>Angewendet in #</w:t>
+      </w:r>
+    </w:p>
+    <w:p>
+      <w:r>
+        <w:t>Impact Controlling, Produkte &amp; Konsum, Wirtschaft &amp; Unternehmen, Lieferketten und öffentlichen Steuerungsfragen.</w:t>
+      </w:r>
+    </w:p>
+    <w:p>
+      <w:r>
+        <w:t>Grenze</w:t>
+      </w:r>
+    </w:p>
+    <w:p>
+      <w:r>
+        <w:t>Nicht als Schönrechnung #</w:t>
+      </w:r>
+    </w:p>
+    <w:p>
+      <w:r>
+        <w:t>Das Werkzeug darf negative Wirkung, Datenlücken oder rote Linien nicht verdecken.</w:t>
+      </w:r>
+    </w:p>
+    <w:p>
+      <w:r>
+        <w:t>Methodenpapier</w:t>
+      </w:r>
+    </w:p>
+    <w:p>
+      <w:r>
+        <w:t>Ausführliches Methodenpapier #</w:t>
+      </w:r>
+    </w:p>
+    <w:p>
+      <w:r>
+        <w:t>Die kurze Toolseite bleibt Einstieg. Das Methodenpapier ist die ausführliche fachliche Grundlage mit DOCX- und PDF-Download.</w:t>
+      </w:r>
+    </w:p>
+    <w:p>
+      <w:r>
+        <w:t>Methodenpapier 21</w:t>
+      </w:r>
+    </w:p>
+    <w:p>
+      <w:r>
+        <w:t>WÖk-IDs und Indikatorenarchitektur</w:t>
+      </w:r>
+    </w:p>
+    <w:p>
+      <w:r>
+        <w:t>Wie Wirkungsdaten eindeutig, prüfbar, vergleichbar und rückkoppelbar werden</w:t>
+      </w:r>
+    </w:p>
+    <w:p>
+      <w:r>
+        <w:t>Methoden &amp; Werkzeuge</w:t>
+      </w:r>
+    </w:p>
+    <w:p>
+      <w:r>
+        <w:t>Werkzeuge in diesem Bereich #</w:t>
+      </w:r>
+    </w:p>
+    <w:p>
+      <w:r>
+        <w:t>Impact Controlling ist der Methodenrahmen. Interaktive Rechner werden als Rechner bezeichnet; statische Zielseiten führen als Methodik oder Dossier weiter.</w:t>
+      </w:r>
+    </w:p>
+    <w:p>
+      <w:r>
+        <w:t>Datenarchitektur</w:t>
+      </w:r>
+    </w:p>
+    <w:p>
+      <w:r>
+        <w:t>WÖk-IDs</w:t>
+      </w:r>
+    </w:p>
+    <w:p>
+      <w:r>
+        <w:t>WÖk-IDs verbinden SDGs, SDG+, NACE, ESRS, GRI, Quellen, Einheiten, Schwellen und Versionen.</w:t>
+      </w:r>
+    </w:p>
+    <w:p>
+      <w:r>
+        <w:t>Warum hier relevant? Sie bilden die Brücke zwischen Referenzrahmen und prüfbarer Wirkungsbewertung.</w:t>
+      </w:r>
+    </w:p>
+    <w:p>
+      <w:r>
+        <w:t>Tool-Suite</w:t>
+      </w:r>
+    </w:p>
+    <w:p>
+      <w:r>
+        <w:t>Methoden in Werkzeuglogik übersetzen #</w:t>
+      </w:r>
+    </w:p>
+    <w:p>
+      <w:r>
+        <w:t>Die Methodenpapiere beschreiben die fachliche Logik. Die Karten führen zu Methodenseiten; sie versprechen keine Interaktion, wenn keine Bedienoberfläche vorhanden ist.</w:t>
+      </w:r>
+    </w:p>
+    <w:p>
+      <w:r>
+        <w:t>Methode</w:t>
+      </w:r>
+    </w:p>
+    <w:p>
+      <w:r>
+        <w:t>WÖk-ID-Browser</w:t>
+      </w:r>
+    </w:p>
+    <w:p>
+      <w:r>
+        <w:t>Wirkungsindikatoren, Quellen, SDG-Bezüge, Datenqualität und Versionen nachvollziehbar ordnen.</w:t>
+      </w:r>
+    </w:p>
+    <w:p>
+      <w:r>
+        <w:t>Methodik</w:t>
+      </w:r>
+    </w:p>
+    <w:p>
+      <w:r>
+        <w:t>Scorecard-Generator</w:t>
+      </w:r>
+    </w:p>
+    <w:p>
+      <w:r>
+        <w:t>Aus WÖk-IDs, Benchmarks und Datenqualität eine prüfbare Bewertungsoberfläche ableiten.</w:t>
+      </w:r>
+    </w:p>
+    <w:p>
+      <w:pPr>
+        <w:pStyle w:val="Heading3"/>
+      </w:pPr>
+      <w:r>
+        <w:t>Quellenanker: Wirkungsökonomie · Benchmarks &amp; Archetypen · https://wirkungsoekonomie.de/werkzeuge/benchmarks-archetypen/ · Druckdatum: 24.05.2026</w:t>
+      </w:r>
+    </w:p>
+    <w:p>
+      <w:r>
+        <w:t>Interne Quelle: werkzeuge/benchmarks-archetypen/index.html</w:t>
+      </w:r>
+    </w:p>
+    <w:p>
+      <w:r>
+        <w:t>Methodenregister</w:t>
+      </w:r>
+    </w:p>
+    <w:p>
+      <w:r>
+        <w:t>Vergleichslogik für Wirkungsbewertung.</w:t>
+      </w:r>
+    </w:p>
+    <w:p>
+      <w:r>
+        <w:t>Benchmarks und Archetypen übersetzen Branchen-, Produkt- und Organisationstypen in nachvollziehbare Bewertungsräume.</w:t>
+      </w:r>
+    </w:p>
+    <w:p>
+      <w:r>
+        <w:t>Onlinefassung</w:t>
+      </w:r>
+    </w:p>
+    <w:p>
+      <w:r>
+        <w:t>Du liest die Onlinefassung</w:t>
+      </w:r>
+    </w:p>
+    <w:p>
+      <w:r>
+        <w:t>Diese Seite ist der öffentliche Einstieg in die Methodik. Vertiefungen, Downloads und Arbeitsmaterial stehen weiter unten gesammelt bereit.</w:t>
+      </w:r>
+    </w:p>
+    <w:p>
+      <w:r>
+        <w:t>Funktion</w:t>
+      </w:r>
+    </w:p>
+    <w:p>
+      <w:r>
+        <w:t>Was es leistet #</w:t>
+      </w:r>
+    </w:p>
+    <w:p>
+      <w:r>
+        <w:t>Benchmarks und Archetypen übersetzen Branchen-, Produkt- und Organisationstypen in nachvollziehbare Bewertungsräume.</w:t>
+      </w:r>
+    </w:p>
+    <w:p>
+      <w:r>
+        <w:t>Anwendung</w:t>
+      </w:r>
+    </w:p>
+    <w:p>
+      <w:r>
+        <w:t>Angewendet in #</w:t>
+      </w:r>
+    </w:p>
+    <w:p>
+      <w:r>
+        <w:t>Impact Controlling, Produkte &amp; Konsum, Wirtschaft &amp; Unternehmen, Lieferketten und öffentlichen Steuerungsfragen.</w:t>
+      </w:r>
+    </w:p>
+    <w:p>
+      <w:r>
+        <w:t>Grenze</w:t>
+      </w:r>
+    </w:p>
+    <w:p>
+      <w:r>
+        <w:t>Nicht als Schönrechnung #</w:t>
+      </w:r>
+    </w:p>
+    <w:p>
+      <w:r>
+        <w:t>Das Werkzeug darf negative Wirkung, Datenlücken oder rote Linien nicht verdecken.</w:t>
+      </w:r>
+    </w:p>
+    <w:p>
+      <w:r>
+        <w:t>Methoden &amp; Werkzeuge</w:t>
+      </w:r>
+    </w:p>
+    <w:p>
+      <w:r>
+        <w:t>Werkzeuge in diesem Bereich #</w:t>
+      </w:r>
+    </w:p>
+    <w:p>
+      <w:r>
+        <w:t>Impact Controlling ist der Methodenrahmen. Interaktive Rechner werden als Rechner bezeichnet; statische Zielseiten führen als Methodik oder Dossier weiter.</w:t>
+      </w:r>
+    </w:p>
+    <w:p>
+      <w:r>
+        <w:t>Vergleichslogik</w:t>
+      </w:r>
+    </w:p>
+    <w:p>
+      <w:r>
+        <w:t>Benchmarks &amp; Archetypen</w:t>
+      </w:r>
+    </w:p>
+    <w:p>
+      <w:r>
+        <w:t>Benchmarks und Archetypen ordnen Aktivitäten, Produkte und Organisationen in vergleichbare Wirkungskorridore ein.</w:t>
+      </w:r>
+    </w:p>
+    <w:p>
+      <w:r>
+        <w:t>Warum hier relevant? Ohne Vergleichsrahmen bleiben Scores abstrakt und nicht entscheidungsfähig.</w:t>
+      </w:r>
+    </w:p>
+    <w:p>
+      <w:r>
+        <w:t>Tool-Suite</w:t>
+      </w:r>
+    </w:p>
+    <w:p>
+      <w:r>
+        <w:t>Methoden in Werkzeuglogik übersetzen #</w:t>
+      </w:r>
+    </w:p>
+    <w:p>
+      <w:r>
+        <w:t>Die Methodenpapiere beschreiben die fachliche Logik. Die Karten führen zu Methodenseiten; sie versprechen keine Interaktion, wenn keine Bedienoberfläche vorhanden ist.</w:t>
+      </w:r>
+    </w:p>
+    <w:p>
+      <w:r>
+        <w:t>Methode</w:t>
+      </w:r>
+    </w:p>
+    <w:p>
+      <w:r>
+        <w:t>WÖk-ID-Browser</w:t>
+      </w:r>
+    </w:p>
+    <w:p>
+      <w:r>
+        <w:t>Wirkungsindikatoren, Quellen, SDG-Bezüge, Datenqualität und Versionen nachvollziehbar ordnen.</w:t>
+      </w:r>
+    </w:p>
+    <w:p>
+      <w:r>
+        <w:t>Methodik</w:t>
+      </w:r>
+    </w:p>
+    <w:p>
+      <w:r>
+        <w:t>Scorecard-Generator</w:t>
+      </w:r>
+    </w:p>
+    <w:p>
+      <w:r>
+        <w:t>Aus WÖk-IDs, Benchmarks und Datenqualität eine prüfbare Bewertungsoberfläche ableiten.</w:t>
+      </w:r>
+    </w:p>
+    <w:p>
+      <w:r>
+        <w:t>Methodik</w:t>
+      </w:r>
+    </w:p>
+    <w:p>
+      <w:r>
+        <w:t>NWI-Rechner</w:t>
+      </w:r>
+    </w:p>
+    <w:p>
+      <w:r>
+        <w:t>Positive, negative und neutrale Wirkung ohne freie Kompensation zusammenführen.</w:t>
+      </w:r>
+    </w:p>
+    <w:p>
+      <w:r>
+        <w:t>Methodik</w:t>
+      </w:r>
+    </w:p>
+    <w:p>
+      <w:r>
+        <w:t>IOI-Rechner</w:t>
+      </w:r>
+    </w:p>
+    <w:p>
+      <w:r>
+        <w:t>Positive Netto-Wirkung je investiertem Euro, Budget oder Kapitaleinsatz sichtbar machen.</w:t>
+      </w:r>
+    </w:p>
+    <w:p>
+      <w:pPr>
+        <w:pStyle w:val="Heading3"/>
+      </w:pPr>
+      <w:r>
+        <w:t>Quellenanker: Inhalt</w:t>
+      </w:r>
+    </w:p>
+    <w:p>
+      <w:r>
+        <w:t>Interne Quelle: dokumente/woek-master-items-final-v1-2/index.html</w:t>
+      </w:r>
+    </w:p>
+    <w:p>
+      <w:r>
+        <w:t>Strukturierte Webfassung aus der gelieferten XLSX-Datei. Der PDF-Fallback bleibt als Original-/Archivquelle auffindbar, führend für das Register ist diese Tabelle.</w:t>
+      </w:r>
+    </w:p>
+    <w:p>
+      <w:r>
+        <w:t>Herunterladen Herunterladen</w:t>
+      </w:r>
+    </w:p>
+    <w:p>
+      <w:r>
+        <w:t>Metadaten</w:t>
+      </w:r>
+    </w:p>
+    <w:p>
+      <w:r>
+        <w:t>Diese Registerseite ersetzt den früheren PDF-Fließtextimport durch die strukturierte XLSX-Quelle. Die Originaldatei bleibt zitierfähig; die Webfassung dient als maschinenlesbare Online-Referenz für Suche, Manifest und WÖk-ID-Verknüpfungen.</w:t>
+      </w:r>
+    </w:p>
+    <w:p>
+      <w:r>
+        <w:t>WÖk-ID-Register</w:t>
+      </w:r>
+    </w:p>
+    <w:p>
+      <w:r>
+        <w:t>Umsetzung</w:t>
+      </w:r>
+    </w:p>
+    <w:p>
+      <w:r>
+        <w:t>Politische Anschlussfähigkeit und Umsetzungsoptionen #</w:t>
+      </w:r>
+    </w:p>
+    <w:p>
+      <w:r>
+        <w:t>Die folgenden politischen Anforderungen beschreiben keinen fertigen Parteibeschluss. Sie markieren den notwendigen Rahmen, damit dieses Wirkungsfeld demokratisch, rechtsstaatlich und praktisch umgesetzt werden kann. Unterschiedliche Parteien können innerhalb dieses Rahmens verschiedene Wege wählen. Entscheidend ist, dass Wirkung sichtbar, überprüfbar, korrigierbar und grundrechtskonform bleibt.</w:t>
+      </w:r>
+    </w:p>
+    <w:p>
+      <w:pPr>
+        <w:pStyle w:val="Heading3"/>
+      </w:pPr>
+      <w:r>
+        <w:t>7.9 Konsequenzen für die WÖk-Architektur</w:t>
+      </w:r>
+    </w:p>
+    <w:p>
+      <w:r>
+        <w:t>Aus dieser Vorlesung fließen drei Punkte zurück in den WÖk-Korpus:</w:t>
       </w:r>
     </w:p>
     <w:p>
@@ -1443,7 +2953,7 @@
         <w:pStyle w:val="ListBullet"/>
       </w:pPr>
       <w:r>
-        <w:t>Begriffstrennung: Wirkung, Wirkungspotenzial, Wirkungsrisiko.</w:t>
+        <w:t>WÖk-ID-Seiten stärker mit Datenqualität, Versionierung und Prüfstatus verbinden.</w:t>
       </w:r>
     </w:p>
     <w:p>
@@ -1451,7 +2961,7 @@
         <w:pStyle w:val="ListBullet"/>
       </w:pPr>
       <w:r>
-        <w:t>Anwendungsszenarien: Auslöser, Wirkpfad, Wirkungsempfänger und Rückkopplung an einem Fall.</w:t>
+        <w:t>Archetypen als Schutz gegen falsche Vergleiche in Produkt-, Unternehmens- und Kommunalbewertung ausbauen.</w:t>
       </w:r>
     </w:p>
     <w:p>
@@ -1459,7 +2969,38 @@
         <w:pStyle w:val="ListBullet"/>
       </w:pPr>
       <w:r>
-        <w:t>Missverständnisse: Reichweite, Aktivität, Reporting oder Absicht als Wirkung auszugeben.</w:t>
+        <w:t>Prüfungsfälle mit absichtlich falscher Vergleichsgruppe anlegen.</w:t>
+      </w:r>
+    </w:p>
+    <w:p>
+      <w:pPr>
+        <w:pStyle w:val="Heading3"/>
+      </w:pPr>
+      <w:r>
+        <w:t>7.10 Kurzfazit</w:t>
+      </w:r>
+    </w:p>
+    <w:p>
+      <w:r>
+        <w:t>WÖk-IDs, Benchmarks und Archetypen ist kein Randthema. Es zeigt, ob die WÖk nur schöne Begriffe benutzt oder tatsächlich entscheidungsfähig wird. Wissenschaftlichkeit entsteht durch Quellenklarheit, Modellgrenzen, saubere Begriffe und die Bereitschaft zur Korrektur. Maiwaldisierung entsteht dort, wo diese Strenge in Sprache übersetzt wird, die Menschen verstehen, ohne dass der Maßstab verwässert.</w:t>
+      </w:r>
+    </w:p>
+    <w:p>
+      <w:pPr>
+        <w:pStyle w:val="Heading2"/>
+      </w:pPr>
+      <w:r>
+        <w:t>8. Prüfungsrelevanz</w:t>
+      </w:r>
+    </w:p>
+    <w:p>
+      <w:r>
+        <w:t>Diese Vorlesung ist prüfungsrelevant, aber die eigentliche Antwortlogik gehört nicht in das öffentliche Studienskript. Zertifikatsfragen, CorrectAnswer, Scoring-Regeln und Fallrubrics werden separat in der geschützten App-Lane unter woek-akademie-app/content/pruefungen/ gepflegt.</w:t>
+      </w:r>
+    </w:p>
+    <w:p>
+      <w:r>
+        <w:t>Für den Fragenpool sind besonders geeignet:</w:t>
       </w:r>
     </w:p>
     <w:p>
@@ -1467,6 +3008,30 @@
         <w:pStyle w:val="ListBullet"/>
       </w:pPr>
       <w:r>
+        <w:t>Begriffstrennung: Wirkung, Wirkungspotenzial, Wirkungsrisiko.</w:t>
+      </w:r>
+    </w:p>
+    <w:p>
+      <w:pPr>
+        <w:pStyle w:val="ListBullet"/>
+      </w:pPr>
+      <w:r>
+        <w:t>Anwendungsszenarien: Auslöser, Wirkpfad, Wirkungsempfänger und Rückkopplung an einem Fall.</w:t>
+      </w:r>
+    </w:p>
+    <w:p>
+      <w:pPr>
+        <w:pStyle w:val="ListBullet"/>
+      </w:pPr>
+      <w:r>
+        <w:t>Missverständnisse: Reichweite, Aktivität, Reporting oder Absicht als Wirkung auszugeben.</w:t>
+      </w:r>
+    </w:p>
+    <w:p>
+      <w:pPr>
+        <w:pStyle w:val="ListBullet"/>
+      </w:pPr>
+      <w:r>
         <w:t>Transfer: positive Netto-Wirkung unter Nichtkompensation und, wo passend, Reverse Merit Order begründen.</w:t>
       </w:r>
     </w:p>
@@ -1475,7 +3040,7 @@
         <w:pStyle w:val="Heading2"/>
       </w:pPr>
       <w:r>
-        <w:t>8. Quellen</w:t>
+        <w:t>9. Quellen</w:t>
       </w:r>
     </w:p>
     <w:p>
@@ -1571,7 +3136,7 @@
         <w:pStyle w:val="Heading2"/>
       </w:pPr>
       <w:r>
-        <w:t>9. Rückfluss in den WÖk-Korpus</w:t>
+        <w:t>10. Rückfluss in den WÖk-Korpus</w:t>
       </w:r>
     </w:p>
     <w:p>

</xml_diff>